<commit_message>
hoàn tất phần thô của BTS, build ra 4 file word hoàn chỉnh
</commit_message>
<xml_diff>
--- a/Templates/BTS/BIÊN BẢN THỎA THUẬN BTS - Templates.docx
+++ b/Templates/BTS/BIÊN BẢN THỎA THUẬN BTS - Templates.docx
@@ -206,7 +206,7 @@
           <w:szCs w:val="26"/>
           <w:lang w:val="en-US"/>
         </w:rPr>
-        <w:t>{{YEAR}}</w:t>
+        <w:t>YEAR</w:t>
       </w:r>
     </w:p>
     <w:p>
@@ -333,7 +333,16 @@
           <w:sz w:val="26"/>
           <w:szCs w:val="26"/>
         </w:rPr>
-        <w:t xml:space="preserve">{{MATRAM}} </w:t>
+        <w:t>MATRAM</w:t>
+      </w:r>
+      <w:r>
+        <w:rPr>
+          <w:rFonts w:asciiTheme="majorHAnsi" w:hAnsiTheme="majorHAnsi" w:cstheme="majorHAnsi"/>
+          <w:bCs w:val="0"/>
+          <w:sz w:val="26"/>
+          <w:szCs w:val="26"/>
+        </w:rPr>
+        <w:t xml:space="preserve"> </w:t>
       </w:r>
       <w:r>
         <w:rPr>
@@ -351,7 +360,7 @@
           <w:sz w:val="26"/>
           <w:szCs w:val="26"/>
         </w:rPr>
-        <w:t>{{CONGTRINH}}</w:t>
+        <w:t>CONGTRINH</w:t>
       </w:r>
       <w:r>
         <w:rPr>
@@ -401,7 +410,7 @@
           <w:szCs w:val="26"/>
           <w:lang w:val="en-US"/>
         </w:rPr>
-        <w:t>{{DUAN}}</w:t>
+        <w:t>DUAN</w:t>
       </w:r>
       <w:r>
         <w:rPr>
@@ -449,7 +458,7 @@
           <w:sz w:val="28"/>
           <w:szCs w:val="28"/>
         </w:rPr>
-        <w:t>Công ty Cổ phần ETELCOM</w:t>
+        <w:t>NHACUNGCAP</w:t>
       </w:r>
       <w:r>
         <w:rPr>
@@ -549,7 +558,7 @@
           <w:szCs w:val="28"/>
           <w:lang w:val="en-US"/>
         </w:rPr>
-        <w:t>{{YEAR}}</w:t>
+        <w:t>YEAR</w:t>
       </w:r>
       <w:r>
         <w:rPr>
@@ -961,20 +970,10 @@
             <w:r>
               <w:rPr>
                 <w:rFonts w:eastAsia="Times New Roman" w:cs="Times New Roman"/>
-                <w:b/>
-                <w:bCs/>
                 <w:szCs w:val="28"/>
                 <w:lang w:val="en-US"/>
               </w:rPr>
-              <w:t>6550.216.493</w:t>
-            </w:r>
-            <w:r>
-              <w:rPr>
-                <w:rFonts w:eastAsia="Times New Roman" w:cs="Times New Roman"/>
-                <w:szCs w:val="28"/>
-                <w:lang w:val="en-US"/>
-              </w:rPr>
-              <w:t xml:space="preserve"> tại Ngân Hàng TMCP Đầu Tư &amp; Phát Triển Việt Nam - Chi nhánh Bình Phướ</w:t>
+              <w:t>6550.216.493 tại Ngân Hàng TMCP Đầu Tư &amp; Phát Triển Việt Nam - Chi nhánh Bình Phướ</w:t>
             </w:r>
             <w:r>
               <w:rPr>
@@ -1057,20 +1056,10 @@
             <w:r>
               <w:rPr>
                 <w:rFonts w:eastAsia="Times New Roman" w:cs="Times New Roman"/>
-                <w:b/>
-                <w:bCs/>
                 <w:szCs w:val="28"/>
                 <w:lang w:val="en-US"/>
               </w:rPr>
-              <w:t>1405.100.142.008</w:t>
-            </w:r>
-            <w:r>
-              <w:rPr>
-                <w:rFonts w:eastAsia="Times New Roman" w:cs="Times New Roman"/>
-                <w:szCs w:val="28"/>
-                <w:lang w:val="en-US"/>
-              </w:rPr>
-              <w:t xml:space="preserve"> tại ngân hàng Thương mại Cổ phần Quân đội – </w:t>
+              <w:t xml:space="preserve">1405.100.142.008 tại ngân hàng Thương mại Cổ phần Quân đội – </w:t>
             </w:r>
           </w:p>
           <w:p>
@@ -1175,7 +1164,7 @@
               <w:contextualSpacing/>
               <w:rPr>
                 <w:rFonts w:eastAsia="Times New Roman" w:cs="Times New Roman"/>
-                <w:b/>
+                <w:bCs/>
                 <w:spacing w:val="60"/>
                 <w:szCs w:val="28"/>
                 <w:lang w:val="en-US"/>
@@ -1184,7 +1173,7 @@
             <w:r>
               <w:rPr>
                 <w:rFonts w:eastAsia="Times New Roman" w:cs="Times New Roman"/>
-                <w:b/>
+                <w:bCs/>
                 <w:spacing w:val="60"/>
                 <w:szCs w:val="28"/>
                 <w:lang w:val="en-US"/>
@@ -1271,7 +1260,7 @@
               <w:contextualSpacing/>
               <w:rPr>
                 <w:rFonts w:eastAsia="Times New Roman" w:cs="Times New Roman"/>
-                <w:b/>
+                <w:bCs/>
                 <w:spacing w:val="60"/>
                 <w:szCs w:val="28"/>
                 <w:lang w:val="en-US"/>
@@ -1280,64 +1269,11 @@
             <w:r>
               <w:rPr>
                 <w:rFonts w:eastAsia="Times New Roman" w:cs="Times New Roman"/>
+                <w:bCs/>
                 <w:szCs w:val="28"/>
                 <w:lang w:val="en-US"/>
               </w:rPr>
-              <w:t xml:space="preserve">Ông </w:t>
-            </w:r>
-            <w:r>
-              <w:rPr>
-                <w:rFonts w:eastAsia="Times New Roman" w:cs="Times New Roman"/>
-                <w:b/>
-                <w:bCs/>
-                <w:szCs w:val="28"/>
-                <w:lang w:val="en-US"/>
-              </w:rPr>
-              <w:t>ĐẶNG</w:t>
-            </w:r>
-            <w:r>
-              <w:rPr>
-                <w:rFonts w:eastAsia="Times New Roman" w:cs="Times New Roman"/>
-                <w:b/>
-                <w:bCs/>
-                <w:szCs w:val="28"/>
-                <w:lang w:val="en-US"/>
-              </w:rPr>
-              <w:t xml:space="preserve"> VĂN DŨNG</w:t>
-            </w:r>
-            <w:r>
-              <w:rPr>
-                <w:rFonts w:eastAsia="Times New Roman" w:cs="Times New Roman"/>
-                <w:szCs w:val="28"/>
-                <w:lang w:val="en-US"/>
-              </w:rPr>
-              <w:t xml:space="preserve">       </w:t>
-            </w:r>
-            <w:r>
-              <w:rPr>
-                <w:rFonts w:eastAsia="Times New Roman" w:cs="Times New Roman"/>
-                <w:szCs w:val="28"/>
-                <w:lang w:val="en-US"/>
-              </w:rPr>
-              <w:t xml:space="preserve">         </w:t>
-            </w:r>
-            <w:r>
-              <w:rPr>
-                <w:rFonts w:eastAsia="Times New Roman" w:cs="Times New Roman"/>
-                <w:szCs w:val="28"/>
-                <w:lang w:val="en-US"/>
-              </w:rPr>
-              <w:t xml:space="preserve">Chức vụ: </w:t>
-            </w:r>
-            <w:r>
-              <w:rPr>
-                <w:rFonts w:eastAsia="Times New Roman" w:cs="Times New Roman"/>
-                <w:b/>
-                <w:bCs/>
-                <w:szCs w:val="28"/>
-                <w:lang w:val="en-US"/>
-              </w:rPr>
-              <w:t>Tổng Giám đốc</w:t>
+              <w:t>Ông ĐẶNG VĂN DŨNG                Chức vụ: Tổng Giám đốc</w:t>
             </w:r>
           </w:p>
         </w:tc>
@@ -1388,7 +1324,7 @@
           <w:sz w:val="28"/>
           <w:szCs w:val="28"/>
         </w:rPr>
-        <w:t>CÔNG TY CỔ PHẦN ETELCOM</w:t>
+        <w:t>NHACUNGCAP</w:t>
       </w:r>
       <w:r>
         <w:rPr>
@@ -1489,7 +1425,7 @@
                 <w:color w:val="0D0D0D" w:themeColor="text1" w:themeTint="F2"/>
                 <w:szCs w:val="28"/>
               </w:rPr>
-              <w:t>Số 10, đường D, KDC Chánh Nghĩa, phường Thủ Dầu Một, thành phố Hồ Chí Minh</w:t>
+              <w:t>DIACHI</w:t>
             </w:r>
           </w:p>
         </w:tc>
@@ -1569,7 +1505,7 @@
                 <w:color w:val="0D0D0D" w:themeColor="text1" w:themeTint="F2"/>
                 <w:szCs w:val="28"/>
               </w:rPr>
-              <w:t>0908.516.789</w:t>
+              <w:t>SDT</w:t>
             </w:r>
           </w:p>
         </w:tc>
@@ -1650,7 +1586,7 @@
                 <w:color w:val="0D0D0D" w:themeColor="text1" w:themeTint="F2"/>
                 <w:szCs w:val="28"/>
               </w:rPr>
-              <w:t>etelcom.jsc@gmail.com</w:t>
+              <w:t>EMAIL</w:t>
             </w:r>
           </w:p>
         </w:tc>
@@ -1722,23 +1658,16 @@
               <w:rPr>
                 <w:color w:val="0D0D0D" w:themeColor="text1" w:themeTint="F2"/>
                 <w:szCs w:val="28"/>
+                <w:lang w:val="en-US"/>
               </w:rPr>
             </w:pPr>
             <w:r>
               <w:rPr>
-                <w:b/>
-                <w:bCs/>
                 <w:color w:val="0D0D0D" w:themeColor="text1" w:themeTint="F2"/>
                 <w:szCs w:val="28"/>
-              </w:rPr>
-              <w:t>8600.376.789</w:t>
-            </w:r>
-            <w:r>
-              <w:rPr>
-                <w:color w:val="0D0D0D" w:themeColor="text1" w:themeTint="F2"/>
-                <w:szCs w:val="28"/>
-              </w:rPr>
-              <w:t xml:space="preserve"> tại ngân hàng BIDV Chi nhánh Nam Bình Dương</w:t>
+                <w:lang w:val="en-US"/>
+              </w:rPr>
+              <w:t>STK</w:t>
             </w:r>
           </w:p>
         </w:tc>
@@ -1808,8 +1737,6 @@
           <w:p>
             <w:pPr>
               <w:rPr>
-                <w:b/>
-                <w:bCs/>
                 <w:color w:val="0D0D0D" w:themeColor="text1" w:themeTint="F2"/>
                 <w:szCs w:val="28"/>
                 <w:shd w:val="clear" w:color="auto" w:fill="FFFFFF"/>
@@ -1817,12 +1744,11 @@
             </w:pPr>
             <w:r>
               <w:rPr>
-                <w:b/>
-                <w:bCs/>
-                <w:spacing w:val="80"/>
-                <w:szCs w:val="28"/>
-              </w:rPr>
-              <w:t>3703198694</w:t>
+                <w:color w:val="0D0D0D" w:themeColor="text1" w:themeTint="F2"/>
+                <w:szCs w:val="28"/>
+                <w:shd w:val="clear" w:color="auto" w:fill="FFFFFF"/>
+              </w:rPr>
+              <w:t>MST</w:t>
             </w:r>
           </w:p>
         </w:tc>
@@ -1895,8 +1821,6 @@
             <w:pPr>
               <w:spacing w:after="120"/>
               <w:rPr>
-                <w:b/>
-                <w:bCs/>
                 <w:color w:val="0D0D0D" w:themeColor="text1" w:themeTint="F2"/>
                 <w:szCs w:val="28"/>
                 <w:lang w:val="en-US"/>
@@ -1906,27 +1830,9 @@
               <w:rPr>
                 <w:color w:val="0D0D0D" w:themeColor="text1" w:themeTint="F2"/>
                 <w:szCs w:val="28"/>
-              </w:rPr>
-              <w:t xml:space="preserve">Ông </w:t>
-            </w:r>
-            <w:r>
-              <w:rPr>
-                <w:b/>
-                <w:bCs/>
-                <w:color w:val="0D0D0D" w:themeColor="text1" w:themeTint="F2"/>
-                <w:szCs w:val="28"/>
-              </w:rPr>
-              <w:t>NGUYỄN DOÃN CƯỜNG</w:t>
-            </w:r>
-            <w:r>
-              <w:rPr>
-                <w:b/>
-                <w:bCs/>
-                <w:color w:val="0D0D0D" w:themeColor="text1" w:themeTint="F2"/>
-                <w:szCs w:val="28"/>
                 <w:lang w:val="en-US"/>
               </w:rPr>
-              <w:t xml:space="preserve">             </w:t>
+              <w:t>DAIDIEN</w:t>
             </w:r>
           </w:p>
         </w:tc>
@@ -1955,12 +1861,11 @@
             </w:r>
             <w:r>
               <w:rPr>
-                <w:b/>
-                <w:bCs/>
                 <w:color w:val="0D0D0D" w:themeColor="text1" w:themeTint="F2"/>
                 <w:szCs w:val="28"/>
-              </w:rPr>
-              <w:t>Tổng Giám đốc</w:t>
+                <w:lang w:val="sv-SE"/>
+              </w:rPr>
+              <w:t>CHUCVU</w:t>
             </w:r>
           </w:p>
         </w:tc>
@@ -2085,7 +1990,42 @@
           <w:sz w:val="28"/>
           <w:szCs w:val="28"/>
         </w:rPr>
-        <w:t xml:space="preserve">Bên A đồng ý cho Bên B đặt trạm phát sóng di động với </w:t>
+        <w:t xml:space="preserve">Bên A đồng ý cho Bên B đặt trạm phát sóng di động </w:t>
+      </w:r>
+      <w:r>
+        <w:rPr>
+          <w:rFonts w:asciiTheme="majorHAnsi" w:hAnsiTheme="majorHAnsi" w:cstheme="majorHAnsi"/>
+          <w:sz w:val="28"/>
+          <w:szCs w:val="28"/>
+          <w:lang w:val="en-US"/>
+        </w:rPr>
+        <w:t xml:space="preserve">- </w:t>
+      </w:r>
+      <w:r>
+        <w:rPr>
+          <w:rFonts w:asciiTheme="majorHAnsi" w:hAnsiTheme="majorHAnsi" w:cstheme="majorHAnsi"/>
+          <w:sz w:val="28"/>
+          <w:szCs w:val="28"/>
+          <w:lang w:val="en-US"/>
+        </w:rPr>
+        <w:t>MATRAM</w:t>
+      </w:r>
+      <w:r>
+        <w:rPr>
+          <w:rFonts w:asciiTheme="majorHAnsi" w:hAnsiTheme="majorHAnsi" w:cstheme="majorHAnsi"/>
+          <w:sz w:val="28"/>
+          <w:szCs w:val="28"/>
+          <w:lang w:val="en-US"/>
+        </w:rPr>
+        <w:t xml:space="preserve"> </w:t>
+      </w:r>
+      <w:r>
+        <w:rPr>
+          <w:rFonts w:asciiTheme="majorHAnsi" w:hAnsiTheme="majorHAnsi" w:cstheme="majorHAnsi"/>
+          <w:sz w:val="28"/>
+          <w:szCs w:val="28"/>
+        </w:rPr>
+        <w:t xml:space="preserve">với </w:t>
       </w:r>
       <w:r>
         <w:rPr>
@@ -2216,7 +2156,7 @@
                 <w:bCs/>
                 <w:szCs w:val="28"/>
               </w:rPr>
-              <w:t>{{MATRAM}}</w:t>
+              <w:t>MATRAM</w:t>
             </w:r>
           </w:p>
         </w:tc>
@@ -2303,7 +2243,7 @@
               <w:rPr>
                 <w:szCs w:val="28"/>
               </w:rPr>
-              <w:t>{{DUAN}}</w:t>
+              <w:t>DUAN</w:t>
             </w:r>
           </w:p>
         </w:tc>
@@ -2390,7 +2330,7 @@
               <w:rPr>
                 <w:szCs w:val="28"/>
               </w:rPr>
-              <w:t>{{CONGTRINH}}</w:t>
+              <w:t>CONGTRINH</w:t>
             </w:r>
           </w:p>
         </w:tc>
@@ -2477,20 +2417,7 @@
               <w:rPr>
                 <w:szCs w:val="28"/>
               </w:rPr>
-              <w:t>{{L1</w:t>
-            </w:r>
-            <w:r>
-              <w:rPr>
-                <w:szCs w:val="28"/>
-                <w:lang w:val="en-US"/>
-              </w:rPr>
-              <w:t>2</w:t>
-            </w:r>
-            <w:r>
-              <w:rPr>
-                <w:szCs w:val="28"/>
-              </w:rPr>
-              <w:t>}}</w:t>
+              <w:t>L12</w:t>
             </w:r>
           </w:p>
         </w:tc>
@@ -2516,20 +2443,7 @@
               <w:rPr>
                 <w:szCs w:val="28"/>
               </w:rPr>
-              <w:t>{{L1</w:t>
-            </w:r>
-            <w:r>
-              <w:rPr>
-                <w:szCs w:val="28"/>
-                <w:lang w:val="en-US"/>
-              </w:rPr>
-              <w:t>1</w:t>
-            </w:r>
-            <w:r>
-              <w:rPr>
-                <w:szCs w:val="28"/>
-              </w:rPr>
-              <w:t>}}</w:t>
+              <w:t>L11</w:t>
             </w:r>
           </w:p>
         </w:tc>
@@ -2610,20 +2524,7 @@
               <w:rPr>
                 <w:szCs w:val="28"/>
               </w:rPr>
-              <w:t>{{L2</w:t>
-            </w:r>
-            <w:r>
-              <w:rPr>
-                <w:szCs w:val="28"/>
-                <w:lang w:val="en-US"/>
-              </w:rPr>
-              <w:t>2</w:t>
-            </w:r>
-            <w:r>
-              <w:rPr>
-                <w:szCs w:val="28"/>
-              </w:rPr>
-              <w:t>}}</w:t>
+              <w:t>L22</w:t>
             </w:r>
           </w:p>
         </w:tc>
@@ -2649,20 +2550,7 @@
               <w:rPr>
                 <w:szCs w:val="28"/>
               </w:rPr>
-              <w:t>{{L2</w:t>
-            </w:r>
-            <w:r>
-              <w:rPr>
-                <w:szCs w:val="28"/>
-                <w:lang w:val="en-US"/>
-              </w:rPr>
-              <w:t>1</w:t>
-            </w:r>
-            <w:r>
-              <w:rPr>
-                <w:szCs w:val="28"/>
-              </w:rPr>
-              <w:t>}}</w:t>
+              <w:t>L21</w:t>
             </w:r>
           </w:p>
         </w:tc>
@@ -2742,20 +2630,7 @@
               <w:rPr>
                 <w:szCs w:val="28"/>
               </w:rPr>
-              <w:t>{{L3</w:t>
-            </w:r>
-            <w:r>
-              <w:rPr>
-                <w:szCs w:val="28"/>
-                <w:lang w:val="en-US"/>
-              </w:rPr>
-              <w:t>2</w:t>
-            </w:r>
-            <w:r>
-              <w:rPr>
-                <w:szCs w:val="28"/>
-              </w:rPr>
-              <w:t>}}</w:t>
+              <w:t>L32</w:t>
             </w:r>
           </w:p>
         </w:tc>
@@ -2781,20 +2656,7 @@
               <w:rPr>
                 <w:szCs w:val="28"/>
               </w:rPr>
-              <w:t>{{L3</w:t>
-            </w:r>
-            <w:r>
-              <w:rPr>
-                <w:szCs w:val="28"/>
-                <w:lang w:val="en-US"/>
-              </w:rPr>
-              <w:t>1</w:t>
-            </w:r>
-            <w:r>
-              <w:rPr>
-                <w:szCs w:val="28"/>
-              </w:rPr>
-              <w:t>}}</w:t>
+              <w:t>L31</w:t>
             </w:r>
           </w:p>
         </w:tc>
@@ -2874,20 +2736,7 @@
               <w:rPr>
                 <w:szCs w:val="28"/>
               </w:rPr>
-              <w:t>{{L4</w:t>
-            </w:r>
-            <w:r>
-              <w:rPr>
-                <w:szCs w:val="28"/>
-                <w:lang w:val="en-US"/>
-              </w:rPr>
-              <w:t>2</w:t>
-            </w:r>
-            <w:r>
-              <w:rPr>
-                <w:szCs w:val="28"/>
-              </w:rPr>
-              <w:t>}}</w:t>
+              <w:t>L42</w:t>
             </w:r>
           </w:p>
         </w:tc>
@@ -2913,20 +2762,7 @@
               <w:rPr>
                 <w:szCs w:val="28"/>
               </w:rPr>
-              <w:t>{{L4</w:t>
-            </w:r>
-            <w:r>
-              <w:rPr>
-                <w:szCs w:val="28"/>
-                <w:lang w:val="en-US"/>
-              </w:rPr>
-              <w:t>1</w:t>
-            </w:r>
-            <w:r>
-              <w:rPr>
-                <w:szCs w:val="28"/>
-              </w:rPr>
-              <w:t>}}</w:t>
+              <w:t>L41</w:t>
             </w:r>
           </w:p>
         </w:tc>
@@ -7048,23 +6884,9 @@
               <w:rPr>
                 <w:rFonts w:asciiTheme="majorHAnsi" w:hAnsiTheme="majorHAnsi" w:cstheme="majorHAnsi"/>
                 <w:sz w:val="28"/>
-              </w:rPr>
-              <w:t xml:space="preserve">Công ty </w:t>
-            </w:r>
-            <w:r>
-              <w:rPr>
-                <w:rFonts w:asciiTheme="majorHAnsi" w:hAnsiTheme="majorHAnsi" w:cstheme="majorHAnsi"/>
-                <w:sz w:val="28"/>
                 <w:lang w:val="en-US"/>
               </w:rPr>
-              <w:t>C</w:t>
-            </w:r>
-            <w:r>
-              <w:rPr>
-                <w:rFonts w:asciiTheme="majorHAnsi" w:hAnsiTheme="majorHAnsi" w:cstheme="majorHAnsi"/>
-                <w:sz w:val="28"/>
-              </w:rPr>
-              <w:t>ổ phần ETELCOM</w:t>
+              <w:t>NHACUNGCAP</w:t>
             </w:r>
           </w:p>
           <w:p>
@@ -7087,7 +6909,7 @@
                 <w:szCs w:val="28"/>
                 <w:lang w:val="en-US"/>
               </w:rPr>
-              <w:t>Tổng Giám đốc</w:t>
+              <w:t>CHUCVU</w:t>
             </w:r>
           </w:p>
         </w:tc>

</xml_diff>

<commit_message>
Hoàn tất build 4 file word BTS
</commit_message>
<xml_diff>
--- a/Templates/BTS/BIÊN BẢN THỎA THUẬN BTS - Templates.docx
+++ b/Templates/BTS/BIÊN BẢN THỎA THUẬN BTS - Templates.docx
@@ -1990,16 +1990,7 @@
           <w:sz w:val="28"/>
           <w:szCs w:val="28"/>
         </w:rPr>
-        <w:t xml:space="preserve">Bên A đồng ý cho Bên B đặt trạm phát sóng di động </w:t>
-      </w:r>
-      <w:r>
-        <w:rPr>
-          <w:rFonts w:asciiTheme="majorHAnsi" w:hAnsiTheme="majorHAnsi" w:cstheme="majorHAnsi"/>
-          <w:sz w:val="28"/>
-          <w:szCs w:val="28"/>
-          <w:lang w:val="en-US"/>
-        </w:rPr>
-        <w:t xml:space="preserve">- </w:t>
+        <w:t xml:space="preserve">Bên A đồng ý cho Bên B đặt </w:t>
       </w:r>
       <w:r>
         <w:rPr>
@@ -3468,7 +3459,7 @@
           <w:sz w:val="28"/>
           <w:szCs w:val="28"/>
         </w:rPr>
-        <w:t xml:space="preserve">Được yêu cầu Bên B dịch chuyển trạm BTS, trong trường hợp trạm nằm trong </w:t>
+        <w:t xml:space="preserve">Được yêu cầu Bên B dịch chuyển trạm BTS, trong trường hợp trạm nằm trong khu vực thuộc phạm vi quy hoạch của Bên A cho các công trình trọng điểm, đã được </w:t>
       </w:r>
       <w:r>
         <w:rPr>
@@ -3477,7 +3468,7 @@
           <w:szCs w:val="28"/>
         </w:rPr>
         <w:lastRenderedPageBreak/>
-        <w:t>khu vực thuộc phạm vi quy hoạch của Bên A cho các công trình trọng điểm, đã được cơ quan có thẩm quyền cho phép;</w:t>
+        <w:t>cơ quan có thẩm quyền cho phép;</w:t>
       </w:r>
     </w:p>
     <w:p>

</xml_diff>